<commit_message>
Rename app to CampusBallot and replace inherited screenshots
</commit_message>
<xml_diff>
--- a/submission/Shreyan_Raghuvanshi_230905247_BT_Assignment2.docx
+++ b/submission/Shreyan_Raghuvanshi_230905247_BT_Assignment2.docx
@@ -52,7 +52,7 @@
         <w:rPr>
           <w:b/>
         </w:rPr>
-        <w:t>Campus Council Vote</w:t>
+        <w:t>CampusBallot</w:t>
       </w:r>
     </w:p>
     <w:p>
@@ -74,13 +74,13 @@
           <w:rPr>
             <w:color w:val="086B61"/>
           </w:rPr>
-          <w:t>https://github.com/gingerale911/CampusVotingDApp</w:t>
+          <w:t>https://github.com/gingerale911/CampusBallot</w:t>
         </w:r>
       </w:hyperlink>
     </w:p>
     <w:p>
       <w:r>
-        <w:t>The repository contains the smart contract, HTML CSS and JavaScript frontend, execution instructions, deployment configuration, automated contract tests and results, and the supporting evidence supplied with the project.</w:t>
+        <w:t>The repository contains the smart contract, HTML CSS and JavaScript frontend, execution instructions, deployment configuration, automated contract tests and results, and current interface screenshots and automated transaction evidence.</w:t>
       </w:r>
     </w:p>
     <w:p>

</xml_diff>